<commit_message>
Report: simpler wording, plain hyphens instead of dashes
Also fix the number of runs in section 1 (5, not 3).

Co-Authored-By: Claude Opus 5.5 <noreply@anthropic.com>
</commit_message>
<xml_diff>
--- a/task1/report/report.docx
+++ b/task1/report/report.docx
@@ -478,7 +478,7 @@
       <w:r>
         <w:t>5.5 Ядро 8×8</w:t>
         <w:tab/>
-        <w:t>12</w:t>
+        <w:t>11</w:t>
       </w:r>
     </w:p>
     <w:p>
@@ -520,7 +520,7 @@
       <w:r>
         <w:t>7 Фрагменты кода на ассемблере</w:t>
         <w:tab/>
-        <w:t>16</w:t>
+        <w:t>15</w:t>
       </w:r>
     </w:p>
     <w:p>
@@ -569,7 +569,7 @@
         <w:rPr>
           <w:b w:val="0"/>
         </w:rPr>
-        <w:t>Задача работы состоит в освоении средств векторизации программ на языке C и в сравнении времени работы нескольких вариантов одной и той же программы: исходной программы без оптимизации, программы, оптимизированной только ключами компилятора, программы, векторизованной полуавтоматически (директивами компилятора и небольшими правками кода), и программы, векторизованной вручную с помощью встроенных функций (intrinsics) векторного расширения процессора.</w:t>
+        <w:t>Цель работы: освоить средства векторизации программ на C и сравнить время работы нескольких вариантов одной программы. Это исходная программа без оптимизации, программа, оптимизированная только ключами компилятора, программа, векторизованная полуавтоматически (директивы компилятора и небольшие правки кода), и программа, векторизованная вручную через встроенные функции (intrinsics) векторного расширения процессора.</w:t>
       </w:r>
     </w:p>
     <w:p>
@@ -580,7 +580,7 @@
         <w:rPr>
           <w:b w:val="0"/>
         </w:rPr>
-        <w:t>По варианту 2 вычисляется транспонированная матрица B = Aᵀ, то есть B[j][i] = A[i][j] для всех i, j от 0 до N − 1. Матрица квадратная, плотная, элементы типа double (8 байт), хранение по строкам. Основной размер N = 8192, при нём каждая матрица занимает 512 МБ, что во много раз больше всех кэшей процессора. Дополнительно замеры проводились для N = 8000, чтобы отделить влияние того, что 8192 является степенью двойки.</w:t>
+        <w:t>По варианту 2 нужно транспонировать матрицу: B = Aᵀ, то есть B[j][i] = A[i][j] для всех i, j от 0 до N-1. Матрица квадратная и плотная, элементы типа double (8 байт), хранение по строкам. Основной размер N = 8192, одна матрица при этом занимает 512 МБ, что намного больше кэшей процессора. Дополнительно замеры делались для N = 8000, чтобы посмотреть, как влияет то, что 8192 является степенью двойки.</w:t>
       </w:r>
     </w:p>
     <w:p>
@@ -591,7 +591,7 @@
         <w:rPr>
           <w:b w:val="0"/>
         </w:rPr>
-        <w:t>Арифметических операций в задаче нет: программа только читает N² чисел и записывает N² чисел, поэтому её скорость определяется работой подсистемы памяти. Основная трудность в том, что одна из двух матриц всегда проходится по столбцам с шагом N·8 байт, и при наивном обходе почти каждое обращение к ней приходится на новую строку кэша. Векторизация здесь даёт выигрыш только вместе с изменением порядка обхода: нужно читать и писать память непрерывными кусками, а перестановку элементов делать в регистрах.</w:t>
+        <w:t>Вычислений в задаче нет, программа только читает N² чисел и записывает N² чисел, поэтому время определяется работой памяти. Одна из матриц всегда обходится по столбцам с шагом N·8 байт, и при простом обходе почти каждое обращение к ней попадает в новую строку кэша. Поэтому одной векторизации мало, нужно ещё менять порядок обхода, чтобы память читалась и писалась непрерывными кусками, а элементы переставлялись в регистрах.</w:t>
       </w:r>
     </w:p>
     <w:p>
@@ -602,7 +602,7 @@
         <w:rPr>
           <w:b w:val="0"/>
         </w:rPr>
-        <w:t>Время измерялось только для самого транспонирования, без выделения и заполнения памяти; для замера использовалась функция clock_gettime (часы CLOCK_MONOTONIC). Каждая конфигурация запускалась 3 раза по 7 повторов, в таблицах приведено наименьшее время. После замеров результат каждого варианта полностью сравнивался с исходной матрицей, все варианты дали верный результат. Скорость в ГБ/с считалась как 2·N²·8 байт (чтение A и запись B), делённое на время.</w:t>
+        <w:t>Время измерялось функцией clock_gettime (часы CLOCK_MONOTONIC) только для самого транспонирования, без выделения и заполнения памяти. Каждая конфигурация запускалась 5 раз по 7 повторов, в таблицы записано наименьшее время. После замеров результат каждого варианта поэлементно сравнивался с исходной матрицей, ошибок не было. Скорость в ГБ/с считалась как 2·N²·8 байт (чтение A и запись B), делённое на время.</w:t>
       </w:r>
     </w:p>
     <w:p>
@@ -622,7 +622,7 @@
         <w:rPr>
           <w:b w:val="0"/>
         </w:rPr>
-        <w:t>Все замеры выполнены на ноутбуке MacBook Pro с процессором Apple M4 Pro при работе от сети. Характеристики получены командами sysctl, sw_vers и clang --version и приведены в таблице 1.</w:t>
+        <w:t>Замеры проводились на ноутбуке MacBook Pro с процессором Apple M4 Pro, подключённом к сети. Характеристики системы (таблица 1) получены командами sysctl, sw_vers и clang --version.</w:t>
       </w:r>
     </w:p>
     <w:p>
@@ -636,7 +636,7 @@
         <w:rPr>
           <w:b w:val="0"/>
         </w:rPr>
-        <w:t>Таблица 1 — Характеристики вычислительной системы</w:t>
+        <w:t>Таблица 1 - Характеристики вычислительной системы</w:t>
       </w:r>
     </w:p>
     <w:tbl>
@@ -1111,7 +1111,7 @@
         <w:rPr>
           <w:b w:val="0"/>
         </w:rPr>
-        <w:t>Программа однопоточная. Планировщик macOS отдаёт такую нагрузку производительному ядру, поэтому для оценок используются параметры P-ядра. У M4 Pro нет расширений AVX, основное векторное расширение — NEON с регистрами по 128 бит, в которые помещается 2 числа double. Кроме него процессор поддерживает SME (Scalable Matrix Extension) — самое новое из доступных расширений. В режиме streaming SVE длина вектора равна 512 битам (8 чисел double), а матричный регистр ZA делится на тайлы 8×8 double. Ключ -mcpu=native в Apple clang 17 SME не включает, поэтому SME-вариант собирался с ключом -mcpu=apple-m4.</w:t>
+        <w:t>Программа однопоточная, macOS запускает её на производительном ядре, поэтому в оценках используются параметры P-ядра. Расширений AVX у M4 Pro нет. Основное векторное расширение здесь NEON с регистрами по 128 бит, в которые помещается 2 числа double. Кроме того, процессор поддерживает SME (Scalable Matrix Extension), это самое новое из доступных расширений. В режиме streaming SVE длина вектора 512 бит (8 чисел double), а матричный регистр ZA делится на тайлы 8×8 double. Apple clang 17 с ключом -mcpu=native SME не включает, поэтому SME-вариант собирался с ключом -mcpu=apple-m4.</w:t>
       </w:r>
     </w:p>
     <w:p>
@@ -1122,7 +1122,7 @@
         <w:rPr>
           <w:b w:val="0"/>
         </w:rPr>
-        <w:t>Исходные тексты, скрипт сборки и замеров run_all.sh и полный вывод замеров results.txt находятся в каталоге task1 репозитория. Полные листинги программы приведены в приложении А.</w:t>
+        <w:t>Исходники, скрипт сборки и замеров run_all.sh и полный вывод замеров results.txt лежат в каталоге task1 репозитория. Полные листинги программы приведены в приложении А.</w:t>
       </w:r>
     </w:p>
     <w:p>
@@ -1142,7 +1142,7 @@
         <w:rPr>
           <w:b w:val="0"/>
         </w:rPr>
-        <w:t>Исходная программа написана «в лоб» (листинг 1): внешний цикл идёт по строкам A, внутренний — по столбцам. Матрица A читается последовательно, а запись в B идёт по столбцу с шагом N·8 байт. Матрицы хранятся с ведущей размерностью ld: элемент (i, j) лежит по адресу i·ld + j. По умолчанию ld = N; параметр понадобится в разделе 4.4. Память выделяется функцией aligned_alloc с выравниванием на 128 байт — по размеру строки кэша M4.</w:t>
+        <w:t>Исходная программа написана напрямую (листинг 1): внешний цикл идёт по строкам A, внутренний по столбцам. A читается последовательно, а в B запись идёт по столбцу с шагом N·8 байт. Матрицы хранятся с ведущей размерностью ld, элемент (i, j) лежит по адресу i·ld + j. По умолчанию ld = N, этот параметр понадобится в разделе 4.4. Память выделяется через aligned_alloc с выравниванием на 128 байт, по размеру строки кэша M4.</w:t>
       </w:r>
     </w:p>
     <w:p>
@@ -1156,7 +1156,7 @@
         <w:rPr>
           <w:b w:val="0"/>
         </w:rPr>
-        <w:t>Листинг 1 — Функция транспонирования в исходной программе</w:t>
+        <w:t>Листинг 1 - Функция транспонирования в исходной программе</w:t>
       </w:r>
     </w:p>
     <w:p>
@@ -1277,7 +1277,7 @@
         <w:rPr>
           <w:b w:val="0"/>
         </w:rPr>
-        <w:t>Таблица 2 — Время исходной программы при разных ключах компилятора</w:t>
+        <w:t>Таблица 2 - Время исходной программы при разных ключах компилятора</w:t>
       </w:r>
     </w:p>
     <w:tbl>
@@ -2088,7 +2088,7 @@
         <w:rPr>
           <w:b w:val="0"/>
         </w:rPr>
-        <w:t>При N = 8000 переход от -O0 к -O1 ускоряет программу в 1,75 раза: убираются лишние загрузки и сохранения переменных цикла в стек. Дальнейшие уровни (-O2, -O3), ключи -mcpu=native и -mcpu=apple-m4, -ffast-math и -funroll-loops время почти не меняют, разница между всеми оптимизированными вариантами не более 2 %. Ключ -ffast-math ни на что не влияет, так как вычислений с плавающей точкой в программе нет.</w:t>
+        <w:t>При N = 8000 переход от -O0 к -O1 ускоряет программу в 1,75 раза, так как компилятор перестаёт хранить переменные цикла в стеке. Дальше (-O2, -O3, -mcpu=native, -mcpu=apple-m4, -ffast-math, -funroll-loops) время почти не меняется, все оптимизированные варианты отличаются не более чем на 2 %. От -ffast-math ничего и не ожидалось, вычислений с плавающей точкой в программе нет.</w:t>
       </w:r>
     </w:p>
     <w:p>
@@ -2099,7 +2099,7 @@
         <w:rPr>
           <w:b w:val="0"/>
         </w:rPr>
-        <w:t>При N = 8192 картина другая. Все оптимизированные версии работают около 0,29 с, а версия -O0 даже немного быстрее — 0,2652 с. Время здесь почти полностью уходит на ожидание памяти: шаг записи в B равен 8192·8 = 64 КБ, такие адреса попадают в одни и те же наборы кэша и вытесняют друг друга (конфликтные промахи). Поэтому сокращение числа команд ничего не даёт, а время при N = 8192 в 2,4 раза больше, чем при N = 8000, хотя данных больше всего на 5 %. Почему -O0 оказался чуть быстрее, точно установить без профилировщика не удалось; вероятно, более редкая выдача записей немного снижает число конфликтов.</w:t>
+        <w:t>При N = 8192 результат другой. Все оптимизированные версии работают около 0,29 с, а -O0 даже немного быстрее, 0,2652 с. Здесь почти всё время уходит на ожидание памяти. Шаг записи в B равен 8192·8 = 64 КБ, такие адреса попадают в одни и те же наборы кэша и вытесняют друг друга (конфликтные промахи). Поэтому от сокращения числа команд толку нет, а время при N = 8192 в 2,4 раза больше, чем при N = 8000, хотя данных больше всего на 5 %. Почему -O0 получился чуть быстрее, без профилировщика точно сказать не получилось. Возможно, при более медленной выдаче записей конфликтов становится немного меньше.</w:t>
       </w:r>
     </w:p>
     <w:p>
@@ -2110,7 +2110,7 @@
         <w:rPr>
           <w:b w:val="0"/>
         </w:rPr>
-        <w:t>Из отчёта векторизатора clang (ключи -Rpass=loop-vectorize, -Rpass-analysis=loop-vectorize) видно, что внутренний цикл в общем случае не векторизуется: «the cost-model indicates that vectorization is not beneficial». Сообщение «vectorized loop (vectorization width: 2)» относится к копии цикла, которую компилятор создаёт для частного случая ld = 1, когда запись идёт подряд. При N &gt; 1 эта ветка не выполняется, и работает скалярный цикл из пар команд ldr d0 / str d0 (раздел 7). Таким образом, одними ключами компилятора задачу ускорить нельзя, нужно менять порядок обхода памяти. Для всех следующих вариантов использовались ключи -O3 -mcpu=native (для SME — -O3 -mcpu=apple-m4).</w:t>
+        <w:t>По отчёту векторизатора clang (ключи -Rpass=loop-vectorize и -Rpass-analysis=loop-vectorize) внутренний цикл в общем случае не векторизуется: «the cost-model indicates that vectorization is not beneficial». Сообщение «vectorized loop (vectorization width: 2)» относится к отдельной копии цикла для частного случая ld = 1, когда запись идёт подряд. При N &gt; 1 эта копия не используется, и работает обычный скалярный цикл из пар команд ldr d0 / str d0 (раздел 7). Получается, что одними ключами компилятора программу не ускорить, нужно менять порядок обхода памяти. Дальше все варианты собирались с -O3 -mcpu=native (SME-вариант с -O3 -mcpu=apple-m4).</w:t>
       </w:r>
     </w:p>
     <w:p>
@@ -2130,7 +2130,7 @@
         <w:rPr>
           <w:b w:val="0"/>
         </w:rPr>
-        <w:t>Полуавтоматическая версия (файл transpose_simd.c) собиралась командой clang -O3 -mcpu=native -fopenmp-simd. Ключ -fopenmp-simd включает обработку директив #pragma omp simd без подключения библиотеки OpenMP. Указатели помечены restrict, чтобы компилятор знал, что A и B не пересекаются. Ниже описаны этапы в том порядке, в котором они делались, а времена сведены в таблицу 3.</w:t>
+        <w:t>Полуавтоматическая версия (transpose_simd.c) собиралась командой clang -O3 -mcpu=native -fopenmp-simd. Ключ -fopenmp-simd включает обработку директив #pragma omp simd без подключения библиотеки OpenMP. Указатели помечены restrict, чтобы компилятор знал, что A и B не пересекаются. Этапы описаны в том порядке, в котором они делались, времена собраны в таблице 3.</w:t>
       </w:r>
     </w:p>
     <w:p>
@@ -2149,7 +2149,7 @@
         <w:rPr>
           <w:b w:val="0"/>
         </w:rPr>
-        <w:t>Сначала циклы были переставлены так, чтобы внутренний цикл шёл по строке B, то есть запись стала непрерывной, а чтение A — с шагом. На внутренний цикл поставлена директива #pragma omp simd. Компилятор сообщает, что цикл векторизован с шириной 2, но в ассемблере видно, что векторная копия цикла (ldp q / stp q) снова построена только для частного случая ld = 1, а при настоящем шаге выполняется скалярный цикл ldr d0 / str d0. Команд сбора (gather) с произвольным шагом в NEON нет, и компилятор посчитал сборку вектора из отдельных загрузок невыгодной. Тем не менее время при N = 8192 уменьшилось с 0,2932 с до 0,1883 с — за счёт того, что непрерывная запись дешевле записи по столбцу. Чтение A по столбцу всё так же даёт промах кэша почти на каждое обращение.</w:t>
+        <w:t>Сначала циклы были переставлены так, чтобы внутренний цикл шёл по строке B. Запись стала непрерывной, а чтение A пошло с шагом. На внутренний цикл добавлена директива #pragma omp simd. Компилятор пишет, что цикл векторизован с шириной 2, но по ассемблеру видно, что векторная копия цикла (ldp q / stp q) опять сделана только для случая ld = 1, а при реальном шаге работает скалярный цикл ldr d0 / str d0. В NEON нет команд сбора (gather) с произвольным шагом, и собирать вектор из отдельных загрузок компилятор счёл невыгодным. Время при N = 8192 всё равно уменьшилось с 0,2932 с до 0,1883 с, потому что непрерывная запись дешевле записи по столбцу. Чтение A по столбцу по-прежнему даёт промах почти на каждом обращении.</w:t>
       </w:r>
     </w:p>
     <w:p>
@@ -2168,7 +2168,7 @@
         <w:rPr>
           <w:b w:val="0"/>
         </w:rPr>
-        <w:t>Чтобы строки кэша A и B использовались полностью, матрица разбивается на блоки BS×BS и транспонирование выполняется поблочно. Пока обрабатывается блок, нужные строки кэша обеих матриц остаются в кэше. Внутри блока остался цикл с omp simd, который, как и в 4.1, в общем случае выполняется скалярно. Время при N = 8192 уменьшилось до 0,0771 с, то есть ещё в 2,44 раза.</w:t>
+        <w:t>Чтобы строки кэша A и B использовались полностью, матрица делится на блоки BS×BS, и транспонирование идёт поблочно. Пока обрабатывается блок, нужные строки обеих матриц остаются в кэше. Внутри блока остался цикл с omp simd, и, как в 4.1, в общем случае он скалярный. Время при N = 8192 уменьшилось до 0,0771 с, ещё в 2,44 раза.</w:t>
       </w:r>
     </w:p>
     <w:p>
@@ -2187,7 +2187,7 @@
         <w:rPr>
           <w:b w:val="0"/>
         </w:rPr>
-        <w:t>Внутри блока BS×BS выделяются микроблоки TS×TS с размером-константой. Оба цикла микроблока полностью развёрнуты директивой #pragma clang loop unroll(full), а выравнивание указателей сообщается компилятору через __builtin_assume_aligned. После развёртки SLP-векторизатор объединяет соседние обращения: из каждой строки A и каждой строки B за раз берётся по TS чисел. Лучший результат дал микроблок 8×8 (64 байта, половина строки кэша), время при N = 8192 — 0,0699 с.</w:t>
+        <w:t>Внутри блока BS×BS выделяются микроблоки TS×TS, размер которых задан константой. Оба цикла микроблока полностью разворачиваются директивой #pragma clang loop unroll(full), выравнивание указателей сообщается компилятору через __builtin_assume_aligned. После развёртки SLP-векторизатор объединяет соседние обращения, и из каждой строки A и B за раз берётся по TS чисел. Лучше всего сработал микроблок 8×8 (64 байта, половина строки кэша), время при N = 8192 составило 0,0699 с.</w:t>
       </w:r>
     </w:p>
     <w:p>
@@ -2198,7 +2198,7 @@
         <w:rPr>
           <w:b w:val="0"/>
         </w:rPr>
-        <w:t>По ассемблеру видно (раздел 7), что clang и здесь не строит транспонирование из векторных перестановок и не использует векторные регистры: блок 8×8 переносится парными скалярными командами ldp d / stp d, каждая из которых читает или пишет два соседних числа (16 байт). То есть полуавтоматическая векторизация в этой задаче свелась к объединению обращений к памяти, а настоящие векторные команды появились только в ручной версии. Для задачи, ограниченной памятью, и этого оказывается достаточно.</w:t>
+        <w:t>В ассемблере (раздел 7) видно, что clang и тут не собирает транспонирование из векторных перестановок и вообще не использует векторные регистры. Блок 8×8 переносится парными скалярными командами ldp d / stp d, каждая читает или пишет два соседних числа (16 байт). Значит, полуавтоматическая векторизация здесь свелась к объединению обращений к памяти, а настоящие векторные команды появились только в ручной версии. Но задача упирается в память, и этого хватает.</w:t>
       </w:r>
     </w:p>
     <w:p>
@@ -2217,7 +2217,7 @@
         <w:rPr>
           <w:b w:val="0"/>
         </w:rPr>
-        <w:t>Даже с блоками время при N = 8192 оставалось в 3,3 раза больше, чем при N = 8000 (0,0699 с против 0,0212 с). Причина та же — конфликтные промахи: строки блока отстоят друг от друга на 64 КБ, и все они попадают в один набор кэша L1. Поэтому к каждой строке матрицы было добавлено 8 неиспользуемых элементов (ld = N + 8, то есть 64 байта). Шаг между строками перестаёт быть степенью двойки, и строки блока распределяются по разным наборам. Время микроблочной версии упало до 0,0230 с, то есть в 3,04 раза. Для сравнения: исходная программа с ld = N + 8 работает 0,1010 с вместо 0,2932 с. Дополнение требует лишь 0,10 % дополнительной памяти.</w:t>
+        <w:t>Даже с блоками время при N = 8192 было в 3,3 раза больше, чем при N = 8000 (0,0699 с и 0,0212 с). Причина опять в конфликтных промахах: строки блока отстоят друг от друга на 64 КБ и все попадают в один набор кэша L1. Поэтому к каждой строке матрицы было добавлено 8 неиспользуемых элементов (ld = N + 8, то есть 64 байта). Шаг между строками перестаёт быть степенью двойки, и строки блока раскладываются по разным наборам. Время микроблочной версии уменьшилось до 0,0230 с, в 3,04 раза. Исходная программа с ld = N + 8 работает 0,1010 с вместо 0,2932 с. Лишней памяти на это уходит всего 0,10 %.</w:t>
       </w:r>
     </w:p>
     <w:p>
@@ -2231,7 +2231,7 @@
         <w:rPr>
           <w:b w:val="0"/>
         </w:rPr>
-        <w:t>Таблица 3 — Время полуавтоматически векторизованной программы, с</w:t>
+        <w:t>Таблица 3 - Время полуавтоматически векторизованной программы, с</w:t>
       </w:r>
     </w:p>
     <w:tbl>
@@ -2656,7 +2656,7 @@
         <w:rPr>
           <w:b w:val="0"/>
         </w:rPr>
-        <w:t>Здесь и далее BS = 256, если не сказано иное. Для варианта omp simd по строкам с ld = N + 8 разброс между повторами был большим (среднее время заметно выше минимального), этот вариант чувствителен к размещению страниц в памяти.</w:t>
+        <w:t>Здесь и дальше BS = 256, если не указано другое. У варианта omp simd по строкам с ld = N + 8 был большой разброс между повторами (среднее время заметно больше минимального), он сильно зависит от того, как страницы легли в памяти.</w:t>
       </w:r>
     </w:p>
     <w:p>
@@ -2675,7 +2675,7 @@
         <w:rPr>
           <w:b w:val="0"/>
         </w:rPr>
-        <w:t>Размер блока BS подбирался при N = 8192, ld = N + 8 (таблица 4), размер микроблока TS — при BS = 256 (таблица 5). Для сравнения в таблицу 4 включены также ручные варианты из раздела 5.</w:t>
+        <w:t>Размер блока BS подбирался при N = 8192 и ld = N + 8 (таблица 4), размер микроблока TS при BS = 256 (таблица 5). В таблицу 4 для сравнения добавлены и ручные варианты из раздела 5.</w:t>
       </w:r>
     </w:p>
     <w:p>
@@ -2689,7 +2689,7 @@
         <w:rPr>
           <w:b w:val="0"/>
         </w:rPr>
-        <w:t>Таблица 4 — Зависимость времени от размера блока BS (N = 8192, ld = N + 8), с</w:t>
+        <w:t>Таблица 4 - Зависимость времени от размера блока BS (N = 8192, ld = N + 8), с</w:t>
       </w:r>
     </w:p>
     <w:tbl>
@@ -3195,7 +3195,7 @@
         <w:rPr>
           <w:b w:val="0"/>
         </w:rPr>
-        <w:t>Таблица 5 — Зависимость времени от размера микроблока TS (N = 8192, ld = N + 8, BS = 256)</w:t>
+        <w:t>Таблица 5 - Зависимость времени от размера микроблока TS (N = 8192, ld = N + 8, BS = 256)</w:t>
       </w:r>
     </w:p>
     <w:tbl>
@@ -3390,7 +3390,7 @@
         <w:rPr>
           <w:b w:val="0"/>
         </w:rPr>
-        <w:t>Маленькие блоки (16 и 32) работают заметно хуже: блок 16×16 занимает в строке матрицы всего 128 байт, и на каждый блок приходится много переходов между далёкими участками памяти. С ростом блока время уменьшается; начиная с BS = 64 различия между размерами блока невелики и для NEON-версии сравнимы с разбросом между запусками. Для полуавтоматической версии лучший результат дал BS = 256, он и использован в основных замерах. Для SME размер блока влияет слабо. Из микроблоков лучшим оказался 8×8: он берёт из строки кэша 64 байта за раз, а 2×2 и 4×4 — только 16 и 32 байта.</w:t>
+        <w:t>Маленькие блоки (16 и 32) работают заметно хуже. Блок 16×16 занимает в строке матрицы всего 128 байт, и на каждый блок приходится много переходов между далёкими участками памяти. С ростом блока время уменьшается, а начиная с BS = 64 разница между размерами небольшая и для NEON-версии сравнима с разбросом между запусками. Для полуавтоматической версии лучший результат получился при BS = 256, он и взят для основных замеров. На SME размер блока почти не влияет. Из микроблоков лучшим оказался 8×8, он берёт из строки кэша 64 байта за раз, а 2×2 и 4×4 только 16 и 32 байта.</w:t>
       </w:r>
     </w:p>
     <w:p>
@@ -3401,7 +3401,7 @@
         <w:rPr>
           <w:b w:val="0"/>
         </w:rPr>
-        <w:t>Таблицы 3 и 4 получены в разных сериях запусков, поэтому одна и та же конфигурация (микроблок 8×8, BS = 256, ld = N + 8) имеет в них немного разное время: 0,0230 и 0,0215 с. Это разброс между запусками программы, связанный, по-видимому, с тем, как ОС размещает страницы матриц в физической памяти. Внутри одной таблицы варианты сравнивались в одинаковых условиях.</w:t>
+        <w:t>Таблицы 3 и 4 сняты в разных сериях запусков, поэтому у одной и той же конфигурации (микроблок 8×8, BS = 256, ld = N + 8) в них немного разное время: 0,0230 и 0,0215 с. Это разброс между запусками программы. Скорее всего, он зависит от того, как ОС размещает страницы матриц в физической памяти. Внутри одной таблицы варианты сравнивались в одинаковых условиях.</w:t>
       </w:r>
     </w:p>
     <w:p>
@@ -3421,7 +3421,7 @@
         <w:rPr>
           <w:b w:val="0"/>
         </w:rPr>
-        <w:t>Ручная векторизация выполнена на встроенных функциях NEON из заголовка arm_neon.h (файл transpose_neon.c), а в разделе 5.6 — на функциях SME из arm_sme.h (файл transpose_sme.c). Каждый этап оформлен отдельной функцией, и все этапы замеряются в одном запуске программы. Результаты сведены в таблицу 6. Там же приведено время копирования того же объёма функцией memcpy: транспонирование не может работать быстрее копирования, поэтому memcpy служит практической оценкой предела.</w:t>
+        <w:t>Ручная векторизация сделана на встроенных функциях NEON из arm_neon.h (transpose_neon.c), а в разделе 5.6 на функциях SME из arm_sme.h (transpose_sme.c). Каждый этап оформлен отдельной функцией, все этапы замеряются в одном запуске программы. Результаты собраны в таблице 6. Там же есть время копирования того же объёма функцией memcpy. Транспонирование не может быть быстрее простого копирования, поэтому memcpy используется как практический предел.</w:t>
       </w:r>
     </w:p>
     <w:p>
@@ -3440,7 +3440,7 @@
         <w:rPr>
           <w:b w:val="0"/>
         </w:rPr>
-        <w:t>Вектор NEON вмещает два числа double, поэтому базовое ядро транспонирует блок 2×2. Две строки блока загружаются командами vld1q_f64, затем команды vtrn1q_f64 и vtrn2q_f64 составляют из них два столбца: из векторов (a00, a01) и (a10, a11) получаются (a00, a10) и (a01, a11). Эти векторы записываются в две строки B командами vst1q_f64 (листинг 2). Матрица обходится такими блоками подряд, без разбиения на большие блоки.</w:t>
+        <w:t>В вектор NEON помещается два числа double, поэтому базовое ядро транспонирует блок 2×2. Две строки блока загружаются командами vld1q_f64, потом vtrn1q_f64 и vtrn2q_f64 делают из них два столбца: из (a00, a01) и (a10, a11) получаются (a00, a10) и (a01, a11). Эти векторы записываются в две строки B командами vst1q_f64 (листинг 2). Матрица обходится такими блоками подряд, без больших блоков.</w:t>
       </w:r>
     </w:p>
     <w:p>
@@ -3454,7 +3454,7 @@
         <w:rPr>
           <w:b w:val="0"/>
         </w:rPr>
-        <w:t>Листинг 2 — Ядро 2×2 на NEON</w:t>
+        <w:t>Листинг 2 - Ядро 2×2 на NEON</w:t>
       </w:r>
     </w:p>
     <w:p>
@@ -3576,7 +3576,7 @@
         <w:rPr>
           <w:b w:val="0"/>
         </w:rPr>
-        <w:t>При ld = N + 8 время составило 0,0523 с против 0,1010 с у исходной программы с тем же ld, то есть ускорение 1,93 раза. Это близко к теоретическому значению 2 для векторов из двух элементов: число команд чтения и записи уменьшилось вдвое, и вдвое реже происходит переход на новую строку B.</w:t>
+        <w:t>При ld = N + 8 время получилось 0,0523 с, у исходной программы с тем же ld было 0,1010 с, ускорение 1,93 раза. Это почти теоретические 2 для векторов из двух элементов: команд чтения и записи стало вдвое меньше, и на новую строку B приходится переходить вдвое реже.</w:t>
       </w:r>
     </w:p>
     <w:p>
@@ -3595,7 +3595,7 @@
         <w:rPr>
           <w:b w:val="0"/>
         </w:rPr>
-        <w:t>Ядро 2×2 было помещено в блочный обход BS×BS, как в разделе 4.2. При ld = N + 8 время уменьшилось до 0,0265 с. Без дополнения строк (ld = N) выигрыш почти пропадает (0,1481 → 0,1446 с): строки блока конфликтуют в кэше, и блочный обход не может удержать их там.</w:t>
+        <w:t>Ядро 2×2 было помещено в блочный обход BS×BS, как в разделе 4.2. При ld = N + 8 время уменьшилось до 0,0265 с. Без дополнения строк (ld = N) выигрыша почти нет (0,1481 с и 0,1446 с), потому что строки блока конфликтуют в кэше и блок в нём не удерживается.</w:t>
       </w:r>
     </w:p>
     <w:p>
@@ -3614,7 +3614,7 @@
         <w:rPr>
           <w:b w:val="0"/>
         </w:rPr>
-        <w:t>Чтобы реже обращаться к памяти и больше данных держать в регистрах, ядро было расширено до 4×4. Читаются 4 строки по 4 числа (8 векторных регистров), перестановки выполняются в регистрах, а затем 4 строки B записываются по 32 байта. Из каждой строки кэша за один заход используется вдвое больше данных, чем в ядре 2×2. Время при ld = N + 8 — 0,0235 с.</w:t>
+        <w:t>Чтобы реже ходить в память и держать больше данных в регистрах, ядро было расширено до 4×4. Читается 4 строки по 4 числа (8 векторных регистров), перестановки делаются в регистрах, затем 4 строки B записываются по 32 байта. Из каждой строки кэша за один заход берётся вдвое больше данных, чем в ядре 2×2. Время при ld = N + 8 составило 0,0235 с.</w:t>
       </w:r>
     </w:p>
     <w:p>
@@ -3633,7 +3633,7 @@
         <w:rPr>
           <w:b w:val="0"/>
         </w:rPr>
-        <w:t>Ядро 4×4 было переписано на парные загрузку и запись (vld1q_f64_x2 и vst1q_f64_x2, по 32 байта), и в цикл добавлена программная предвыборка строк A на несколько микроблоков вперёд (__builtin_prefetch). Время не уменьшилось: 0,0245 с против 0,0235 с при ld = N + 8 и 0,0256 с против 0,0230 с при N = 8000. Аппаратный механизм предвыборки M4 сам распознаёт последовательное чтение строк, и дополнительные команды только занимают конвейер. Программная предвыборка в следующем этапе не использовалась.</w:t>
+        <w:t>Дальше ядро 4×4 было переписано на парные загрузку и запись (vld1q_f64_x2 и vst1q_f64_x2, по 32 байта), и в цикл добавлена программная предвыборка строк A на несколько микроблоков вперёд (__builtin_prefetch). Время не уменьшилось: 0,0245 с вместо 0,0235 с при ld = N + 8 и 0,0256 с вместо 0,0230 с при N = 8000. Аппаратная предвыборка M4 сама справляется с последовательным чтением строк, а лишние команды только занимают конвейер. На следующем этапе программная предвыборка не использовалась.</w:t>
       </w:r>
     </w:p>
     <w:p>
@@ -3652,7 +3652,7 @@
         <w:rPr>
           <w:b w:val="0"/>
         </w:rPr>
-        <w:t>Ядро 8×8 составлено из четырёх ядер 4×4 с парными загрузками. Из каждой строки кэша A и B за один заход берётся 64 байта, как и в лучшем полуавтоматическом варианте. Время при ld = N + 8 составило 0,0247 с против 0,0235 с у ядра 4×4, при N = 8000 — 0,0232 с против 0,0230 с. Ядра 4×4 и 8×8 дают практически одинаковое время: разница между ними не превышает разброса между запусками (в предыдущих сериях замеров ядро 8×8 было немного быстрее ядра 4×4, в итоговой — наоборот). Видимо, уже ядро 4×4 загружает подсистему памяти до предела, который допускает такой порядок обхода. В ассемблере (раздел 7) видно, что ядро компилируется ровно в задуманные команды: ld1.2d по два регистра, zip1.2d/zip2.2d (так clang записывает trn1/trn2 для 64-битных элементов) и st1.2d.</w:t>
+        <w:t>Ядро 8×8 собрано из четырёх ядер 4×4 с парными загрузками. Из каждой строки кэша A и B за один заход берётся 64 байта, как в лучшем полуавтоматическом варианте. При ld = N + 8 время составило 0,0247 с (у ядра 4×4 было 0,0235 с), при N = 8000 0,0232 с (у ядра 4×4 0,0230 с). Ядра 4×4 и 8×8 работают практически одинаково, разница меньше разброса между запусками. В предыдущих сериях замеров ядро 8×8 было немного быстрее 4×4, в итоговой получилось наоборот. Похоже, уже ядро 4×4 нагружает память настолько, насколько позволяет такой порядок обхода. В ассемблере (раздел 7) видны ожидаемые команды: ld1.2d по два регистра, zip1.2d/zip2.2d (так clang записывает trn1/trn2 для 64-битных элементов) и st1.2d.</w:t>
       </w:r>
     </w:p>
     <w:p>
@@ -3671,7 +3671,7 @@
         <w:rPr>
           <w:b w:val="0"/>
         </w:rPr>
-        <w:t>Расширение SME позволяет транспонировать блок вообще без перестановок. Матричный регистр ZA делится на 8 тайлов ZA0.D–ZA7.D по 8×8 чисел double. Строку тайла можно загрузить «горизонтально» командой svld1_hor_za64, а выгрузить «вертикально» командой svst1_ver_za64, то есть по столбцу. Загрузив 8 строк блока A и выгрузив 8 столбцов тайла в строки B, получаем транспонированный блок 8×8 (листинг 3). Функцию с этими командами нужно пометить двумя атрибутами: __arm_locally_streaming и __arm_new("za"). Тогда компилятор сам включает streaming-режим и регистр ZA в начале функции (smstart) и выключает в конце (smstop), поэтому переключение происходит один раз за всё транспонирование.</w:t>
+        <w:t>В SME блок можно транспонировать вообще без перестановок. Матричный регистр ZA делится на 8 тайлов ZA0.D-ZA7.D по 8×8 чисел double. Строку тайла можно загрузить «горизонтально» командой svld1_hor_za64, а выгрузить «вертикально» командой svst1_ver_za64, то есть по столбцу. Если загрузить 8 строк блока A и выгрузить 8 столбцов тайла в строки B, получится транспонированный блок 8×8 (листинг 3). Функцию с такими командами нужно пометить атрибутами __arm_locally_streaming и __arm_new("za"). Тогда компилятор сам включает streaming-режим и регистр ZA в начале функции (smstart) и выключает их в конце (smstop), так что переключение происходит один раз за всё транспонирование.</w:t>
       </w:r>
     </w:p>
     <w:p>
@@ -3685,7 +3685,7 @@
         <w:rPr>
           <w:b w:val="0"/>
         </w:rPr>
-        <w:t>Листинг 3 — Транспонирование блока 8×8 через тайл ZA0</w:t>
+        <w:t>Листинг 3 - Транспонирование блока 8×8 через тайл ZA0</w:t>
       </w:r>
     </w:p>
     <w:p>
@@ -3777,7 +3777,7 @@
         <w:rPr>
           <w:b w:val="0"/>
         </w:rPr>
-        <w:t>Вариант с одним тайлом и блочным обходом дал 0,0322 с при ld = N, 0,0298 с при ld = N + 8 и 0,0281 с при N = 8000. Вторым этапом был опробован блок 16×16 из четырёх тайлов, чтобы в B писалось сразу по 128 байт (целая строка кэша). Он оказался не быстрее: 0,0365, 0,0311 и 0,0330 с, поэтому лучшим SME-вариантом остаётся тайл 8×8.</w:t>
+        <w:t>Вариант с одним тайлом и блочным обходом дал 0,0322 с при ld = N, 0,0298 с при ld = N + 8 и 0,0281 с при N = 8000. Затем был опробован блок 16×16 из четырёх тайлов, чтобы в B сразу писалось по 128 байт (целая строка кэша). Быстрее не стало (0,0365, 0,0311 и 0,0330 с), так что лучшим SME-вариантом остался тайл 8×8.</w:t>
       </w:r>
     </w:p>
     <w:p>
@@ -3788,7 +3788,7 @@
         <w:rPr>
           <w:b w:val="0"/>
         </w:rPr>
-        <w:t>Интересно, что SME-вариант почти не чувствителен к дополнению строк: при ld = N он в 3,0 раза быстрее NEON-ядра 8×8. Обращения к памяти в streaming-режиме выполняет отдельный матричный блок процессора, общий для кластера ядер и подключённый к кэшу L2, а не к L1 ядра. По-видимому, поэтому конфликты в L1 на него и не влияют. Но при ld = N + 8 NEON быстрее (0,0247 с против 0,0298 с): по-видимому, у матричного блока больше задержка доступа к памяти, а теоретическое преимущество в ширине вектора (8 чисел против 2) в задаче без вычислений не используется.</w:t>
+        <w:t>SME-вариант почти не зависит от дополнения строк: при ld = N он в 3,0 раза быстрее NEON-ядра 8×8. В streaming-режиме к памяти обращается отдельный матричный блок процессора, общий для кластера ядер и подключённый к кэшу L2, а не к L1 ядра. Видимо, поэтому конфликты в L1 на него не влияют. Зато при ld = N + 8 быстрее оказывается NEON (0,0247 с против 0,0298 с). Скорее всего, у матричного блока больше задержка доступа к памяти, а более широкий вектор (8 чисел вместо 2) в задаче без вычислений ничего не даёт.</w:t>
       </w:r>
     </w:p>
     <w:p>
@@ -3802,7 +3802,7 @@
         <w:rPr>
           <w:b w:val="0"/>
         </w:rPr>
-        <w:t>Таблица 6 — Время программы с ручной векторизацией, с</w:t>
+        <w:t>Таблица 6 - Время программы с ручной векторизацией, с</w:t>
       </w:r>
     </w:p>
     <w:tbl>
@@ -4539,7 +4539,7 @@
         <w:rPr>
           <w:b w:val="0"/>
         </w:rPr>
-        <w:t>Этапы 5.1–5.3 последовательно уменьшали время, переход к ядру 8×8 заметного выигрыша уже не дал. Этап с предвыборкой и вариант SME с четырьмя тайлами времени не уменьшили и в дальнейшем не использовались.</w:t>
+        <w:t>Этапы 5.1-5.3 каждый раз уменьшали время, а переход к ядру 8×8 заметного выигрыша уже не дал. Предвыборка и SME-вариант с четырьмя тайлами время не уменьшили, дальше они не использовались.</w:t>
       </w:r>
     </w:p>
     <w:p>
@@ -4559,7 +4559,7 @@
         <w:rPr>
           <w:b w:val="0"/>
         </w:rPr>
-        <w:t>В таблице 7 приведены результаты последовательных оптимизаций при N = 8192. Ускорение считается относительно исходной программы, собранной с -O0. Скорость — объём прочитанных и записанных данных, делённый на время.</w:t>
+        <w:t>В таблице 7 собраны результаты последовательных оптимизаций при N = 8192. Ускорение считается относительно исходной программы, собранной с -O0, скорость как объём прочитанных и записанных данных, делённый на время.</w:t>
       </w:r>
     </w:p>
     <w:p>
@@ -4573,7 +4573,7 @@
         <w:rPr>
           <w:b w:val="0"/>
         </w:rPr>
-        <w:t>Таблица 7 — Результаты последовательных оптимизаций (N = 8192)</w:t>
+        <w:t>Таблица 7 - Результаты последовательных оптимизаций (N = 8192)</w:t>
       </w:r>
     </w:p>
     <w:tbl>
@@ -5666,7 +5666,7 @@
         <w:rPr>
           <w:b w:val="0"/>
         </w:rPr>
-        <w:t>Рисунок 1 — Время работы вариантов программы при N = 8192</w:t>
+        <w:t>Рисунок 1 - Время работы вариантов программы при N = 8192</w:t>
       </w:r>
     </w:p>
     <w:p>
@@ -5677,7 +5677,7 @@
         <w:rPr>
           <w:b w:val="0"/>
         </w:rPr>
-        <w:t>Теоретическое ускорение от векторизации на NEON равно 2 (128 бит / 64 бита), на SME — 8 (512 бит / 64 бита). Эта оценка относится к числу команд, а не ко времени. Для NEON она подтвердилась при сравнении скалярного и векторного вариантов с одинаковым обходом: 0,1010 с и 0,0523 с, ускорение 1,93. Для SME восьмикратного выигрыша нет, потому что в задаче нет вычислений и время определяется памятью, а не числом команд.</w:t>
+        <w:t>Теоретически векторизация на NEON даёт ускорение в 2 раза (128 бит / 64 бита), на SME в 8 раз (512 бит / 64 бита). Эта оценка относится к числу команд, а не ко времени. Для NEON она подтвердилась, если сравнить скалярный и векторный варианты с одинаковым обходом: 0,1010 с и 0,0523 с, ускорение 1,93. На SME восьмикратного выигрыша нет, потому что вычислений в задаче нет и время зависит от памяти, а не от числа команд.</w:t>
       </w:r>
     </w:p>
     <w:p>
@@ -5688,7 +5688,7 @@
         <w:rPr>
           <w:b w:val="0"/>
         </w:rPr>
-        <w:t>Практическую верхнюю границу задаёт копирование того же объёма: memcpy выполняется за 0,0082 с (130,9 ГБ/с). Лучшие варианты транспонирования работают 0,0230 с, то есть в 2,8 раза медленнее копирования. Разница объясняется тем, что копирование идёт строго последовательно и хорошо предсказывается аппаратной предвыборкой, а транспонирование одновременно работает с 8 строками A и 8 строками B, находящимися далеко друг от друга, и использует каждую строку кэша B за несколько заходов.</w:t>
+        <w:t>Практический предел задаёт копирование того же объёма: memcpy выполняется за 0,0082 с (130,9 ГБ/с). Лучшие варианты транспонирования работают 0,0230 с, в 2,8 раза медленнее копирования. Копирование идёт строго последовательно, и аппаратная предвыборка с ним хорошо справляется. Транспонирование же работает одновременно с 8 строками A и 8 строками B, которые лежат далеко друг от друга, и каждую строку кэша B заполняет за несколько заходов.</w:t>
       </w:r>
     </w:p>
     <w:p>
@@ -5699,7 +5699,7 @@
         <w:rPr>
           <w:b w:val="0"/>
         </w:rPr>
-        <w:t>Итоговое ускорение относительно исходной программы составило 11,5 раза. Основной вклад дали изменение порядка обхода (блоки) и устранение конфликтных промахов (дополнение строк); сама векторизация дала около двух раз, как и ожидалось теоретически. Полуавтоматическая версия с микроблоком 8×8 и лучшая ручная версия на NEON (ядро 4×4) показали близкое время (0,0230 и 0,0235 с).</w:t>
+        <w:t>Итоговое ускорение относительно исходной программы получилось 11,5 раза. Больше всего дали изменение порядка обхода (блоки) и устранение конфликтных промахов (дополнение строк), сама векторизация дала примерно в 2 раза, как и ожидалось. Полуавтоматическая версия с микроблоком 8×8 и лучшая ручная версия на NEON (ядро 4×4) показали близкое время, 0,0230 и 0,0235 с.</w:t>
       </w:r>
     </w:p>
     <w:p>
@@ -5719,7 +5719,7 @@
         <w:rPr>
           <w:b w:val="0"/>
         </w:rPr>
-        <w:t>Ассемблерный код получен командой clang -O3 -mcpu=native -S (для SME — -mcpu=apple-m4), полные файлы лежат в каталоге task1/asm. В листинге 4 приведён внутренний цикл исходной программы. Каждый элемент переносится отдельной парой скалярных команд ldr d0 / str d0, адрес записи увеличивается на ld·8 байт.</w:t>
+        <w:t>Ассемблерный код получен командой clang -O3 -mcpu=native -S (для SME с -mcpu=apple-m4), полные файлы лежат в каталоге task1/asm. В листинге 4 приведён внутренний цикл исходной программы. Каждый элемент переносится отдельной парой скалярных команд ldr d0 / str d0, адрес записи каждый раз увеличивается на ld·8 байт.</w:t>
       </w:r>
     </w:p>
     <w:p>
@@ -5733,7 +5733,7 @@
         <w:rPr>
           <w:b w:val="0"/>
         </w:rPr>
-        <w:t>Листинг 4 — Внутренний цикл исходной программы (-O3)</w:t>
+        <w:t>Листинг 4 - Внутренний цикл исходной программы (-O3)</w:t>
       </w:r>
     </w:p>
     <w:p>
@@ -5869,7 +5869,7 @@
         <w:rPr>
           <w:b w:val="0"/>
         </w:rPr>
-        <w:t>Листинг 5 — Фрагмент микроблока 8×8 полуавтоматической версии</w:t>
+        <w:t>Листинг 5 - Фрагмент микроблока 8×8 полуавтоматической версии</w:t>
       </w:r>
     </w:p>
     <w:p>
@@ -6260,7 +6260,7 @@
         <w:rPr>
           <w:b w:val="0"/>
         </w:rPr>
-        <w:t>Листинг 6 — Ядро 4×4 в составе ядра 8×8 (NEON)</w:t>
+        <w:t>Листинг 6 - Ядро 4×4 в составе ядра 8×8 (NEON)</w:t>
       </w:r>
     </w:p>
     <w:p>
@@ -6636,7 +6636,7 @@
         <w:rPr>
           <w:b w:val="0"/>
         </w:rPr>
-        <w:t>Листинг 7 — Внутренний цикл SME-версии (тайл ZA0, 8×8)</w:t>
+        <w:t>Листинг 7 - Внутренний цикл SME-версии (тайл ZA0, 8×8)</w:t>
       </w:r>
     </w:p>
     <w:p>
@@ -7320,7 +7320,7 @@
         <w:rPr>
           <w:b w:val="0"/>
         </w:rPr>
-        <w:t>В работе исследована векторизация транспонирования плотной матрицы double размером 8192×8192 на процессоре Apple M4 Pro. Исходная программа работает 0,2652 с, и ключи компилятора её не ускоряют: внутренний цикл с записью по столбцу компилятор не векторизует, а время определяется промахами кэша.</w:t>
+        <w:t>В работе рассмотрена векторизация транспонирования плотной матрицы double размером 8192×8192 на Apple M4 Pro. Исходная программа работает 0,2652 с, и ключи компилятора её не ускоряют: цикл с записью по столбцу компилятор не векторизует, а время определяется промахами кэша.</w:t>
       </w:r>
     </w:p>
     <w:p>
@@ -7331,7 +7331,7 @@
         <w:rPr>
           <w:b w:val="0"/>
         </w:rPr>
-        <w:t>Полуавтоматическая векторизация (omp simd, restrict, блочный обход, микроблок 8×8 с полной развёрткой) вместе с дополнением строк до ld = N + 8 уменьшила время до 0,0230 с. При этом настоящих векторных команд clang так и не построил: циклы с omp simd в общем случае остались скалярными, а микроблок переносится парными скалярными командами ldp d / stp d. Ручная векторизация на NEON (лучшее ядро — 4×4) дала 0,0235 с, то есть практически столько же. Общее ускорение относительно исходной программы — 11,5 раза, а до предела, заданного копированием памяти, остаётся примерно 2,8 раза.</w:t>
+        <w:t>Полуавтоматическая векторизация (omp simd, restrict, блочный обход, микроблок 8×8 с полной развёрткой) вместе с дополнением строк до ld = N + 8 уменьшила время до 0,0230 с. Настоящих векторных команд clang при этом так и не сделал: циклы с omp simd в общем случае остались скалярными, а микроблок переносится парными скалярными командами ldp d / stp d. Ручная векторизация на NEON (лучшее ядро 4×4) дала 0,0235 с, почти столько же. Общее ускорение относительно исходной программы 11,5 раза, до предела, который задаёт копирование памяти, остаётся примерно 2,8 раза.</w:t>
       </w:r>
     </w:p>
     <w:p>
@@ -7342,7 +7342,7 @@
         <w:rPr>
           <w:b w:val="0"/>
         </w:rPr>
-        <w:t>Векторизация сама по себе дала ускорение 1,93, что соответствует теоретическому значению 2 для NEON. Наибольший же выигрыш дали изменения работы с памятью: блочный обход и устранение конфликтных промахов при размере матрицы, равном степени двойки (ускорение в 3,0 раза для одной и той же программы). Программная предвыборка не помогла. Самое новое расширение SME позволяет транспонировать блок без перестановок и не страдает от конфликтов в L1, но в этой задаче оно уступило NEON из-за большей задержки доступа к памяти.</w:t>
+        <w:t>Сама векторизация дала ускорение 1,93, что соответствует теоретическим 2 для NEON. Больше всего выиграли за счёт работы с памятью, то есть блочного обхода и устранения конфликтных промахов при размере матрицы, равном степени двойки (для одной и той же программы ускорение в 3,0 раза). Программная предвыборка не помогла. SME, самое новое расширение, позволяет транспонировать блок без перестановок и не страдает от конфликтов в L1, но в этой задаче оказалось медленнее NEON, скорее всего из-за большей задержки доступа к памяти.</w:t>
       </w:r>
     </w:p>
     <w:p>
@@ -7353,7 +7353,7 @@
         <w:rPr>
           <w:b w:val="0"/>
         </w:rPr>
-        <w:t>Получившаяся блочная структура программы подходит для следующих заданий: блоки BS×BS независимы и могут обрабатываться разными потоками OpenMP, а при распределении по процессам MPI удобно делить матрицу на полосы строк.</w:t>
+        <w:t>Блочная структура программы пригодится в следующих заданиях: блоки BS×BS независимы и их можно раздать разным потокам OpenMP, а для MPI матрицу удобно делить на полосы строк.</w:t>
       </w:r>
     </w:p>
     <w:p>
@@ -7388,7 +7388,7 @@
         <w:rPr>
           <w:b w:val="0"/>
         </w:rPr>
-        <w:t>Листинг А.1 — common.h. Общая часть: память, проверка, замер времени</w:t>
+        <w:t>Листинг А.1 - common.h. Общая часть: память, проверка, замер времени</w:t>
       </w:r>
     </w:p>
     <w:p>
@@ -8850,7 +8850,7 @@
         <w:rPr>
           <w:b w:val="0"/>
         </w:rPr>
-        <w:t>Листинг А.2 — transpose_naive.c. Исходная программа</w:t>
+        <w:t>Листинг А.2 - transpose_naive.c. Исходная программа</w:t>
       </w:r>
     </w:p>
     <w:p>
@@ -9290,7 +9290,7 @@
         <w:rPr>
           <w:b w:val="0"/>
         </w:rPr>
-        <w:t>Листинг А.3 — transpose_simd.c. Полуавтоматическая векторизация</w:t>
+        <w:t>Листинг А.3 - transpose_simd.c. Полуавтоматическая векторизация</w:t>
       </w:r>
     </w:p>
     <w:p>
@@ -10598,7 +10598,7 @@
         <w:rPr>
           <w:b w:val="0"/>
         </w:rPr>
-        <w:t>Листинг А.4 — transpose_neon.c. Ручная векторизация на NEON</w:t>
+        <w:t>Листинг А.4 - transpose_neon.c. Ручная векторизация на NEON</w:t>
       </w:r>
     </w:p>
     <w:p>
@@ -13754,7 +13754,7 @@
         <w:rPr>
           <w:b w:val="0"/>
         </w:rPr>
-        <w:t>Листинг А.5 — transpose_sme.c. Векторизация на SME</w:t>
+        <w:t>Листинг А.5 - transpose_sme.c. Векторизация на SME</w:t>
       </w:r>
     </w:p>
     <w:p>

</xml_diff>